<commit_message>
Rename report builder scripts to dhananjay_final_interim_report.py and dhananjay_final_capston_report.py and sync reports
</commit_message>
<xml_diff>
--- a/reports/QM 640_Final_Report_DhananjayVerma-0291493.docx
+++ b/reports/QM 640_Final_Report_DhananjayVerma-0291493.docx
@@ -284,9 +284,9 @@
         <w:br/>
         <w:t>│   ├── run_capstone_analytics.py         [Core statistical, econometric &amp; ML execution engine]</w:t>
         <w:br/>
-        <w:t>│   ├── build_full_interim_report.py      [Automated Interim Report document compiler]</w:t>
+        <w:t>│   ├── dhananjay_final_interim_report.py [Automated Interim Report document compiler]</w:t>
         <w:br/>
-        <w:t>│   └── build_full_final_report.py        [Automated Final Report document compiler]</w:t>
+        <w:t>│   └── dhananjay_final_capston_report.py [Automated Final Report document compiler]</w:t>
         <w:br/>
         <w:t>│</w:t>
         <w:br/>

</xml_diff>

<commit_message>
Rename scripts to build_full_interim_report.py, build_full_final_report.py, and dhananjay_final_capston_report_analytics.py
</commit_message>
<xml_diff>
--- a/reports/QM 640_Final_Report_DhananjayVerma-0291493.docx
+++ b/reports/QM 640_Final_Report_DhananjayVerma-0291493.docx
@@ -282,11 +282,11 @@
         <w:br/>
         <w:t>├── scripts/</w:t>
         <w:br/>
-        <w:t>│   ├── run_capstone_analytics.py         [Core statistical, econometric &amp; ML execution engine]</w:t>
+        <w:t>│   ├── dhananjay_final_capston_report_analytics.py         [Core statistical, econometric &amp; ML execution engine]</w:t>
         <w:br/>
-        <w:t>│   ├── dhananjay_final_interim_report.py [Automated Interim Report document compiler]</w:t>
+        <w:t>│   ├── build_full_interim_report.py [Automated Interim Report document compiler]</w:t>
         <w:br/>
-        <w:t>│   └── dhananjay_final_capston_report.py [Automated Final Report document compiler]</w:t>
+        <w:t>│   └── build_full_final_report.py [Automated Final Report document compiler]</w:t>
         <w:br/>
         <w:t>│</w:t>
         <w:br/>

</xml_diff>

<commit_message>
Update Repository Directory Architecture in Final and Interim Reports (.docx and .pdf)
</commit_message>
<xml_diff>
--- a/reports/QM 640_Final_Report_DhananjayVerma-0291493.docx
+++ b/reports/QM 640_Final_Report_DhananjayVerma-0291493.docx
@@ -10708,7 +10708,7 @@
           <w:color w:val="19375F"/>
           <w:sz w:val="24"/>
         </w:rPr>
-        <w:t>Tools and Technologies</w:t>
+        <w:t>Tools, Technologies, and Repository Directory Architecture</w:t>
       </w:r>
     </w:p>
     <w:p>
@@ -10723,6 +10723,210 @@
           <w:sz w:val="22"/>
         </w:rPr>
         <w:t>The complete analytical and reporting pipeline was built using an open-source, industry-standard Python 3.11 data science stack: (1) Pandas (v2.2) and NumPy (v1.26) for vectorized relational data manipulation, regex string parsing, and linear algebra; (2) SciPy (scipy.stats) and Statsmodels (statsmodels.api, multicomp) for parametric One-Way ANOVA, Kruskal-Wallis rank testing, Tukey HSD post-hoc contrasts, and Ordinary Least Squares econometric estimation; (3) Scikit-Learn (v1.4) for stratified train/test splitting, k-fold cross-validation, StandardScaler preprocessing, Logistic Regression, Random Forest, Gradient Boosting, K-Means clustering, Principal Component Analysis, and classification/clustering evaluation metrics; (4) Matplotlib (v3.8) and Seaborn (v0.13) for automated 300 DPI publication-grade figure rendering; (5) Python-Docx and Windows COM automation for programmatic APA 7 Word and PDF compilation; and (6) Git / GitHub for version control and public data/code hosting.</w:t>
+      </w:r>
+    </w:p>
+    <w:p>
+      <w:pPr>
+        <w:spacing w:after="120" w:line="276" w:lineRule="auto"/>
+        <w:jc w:val="left"/>
+      </w:pPr>
+      <w:r>
+        <w:rPr>
+          <w:rFonts w:ascii="Times New Roman" w:hAnsi="Times New Roman"/>
+          <w:i w:val="0"/>
+          <w:sz w:val="22"/>
+        </w:rPr>
+        <w:t>All raw data, engineered datasets, executable Jupyter Notebooks (.ipynb), and automated report generation scripts are publicly hosted in the project GitHub repository at the following permanent URLs:</w:t>
+      </w:r>
+    </w:p>
+    <w:p>
+      <w:pPr>
+        <w:spacing w:after="60" w:line="276" w:lineRule="auto"/>
+        <w:jc w:val="left"/>
+      </w:pPr>
+      <w:r>
+        <w:rPr>
+          <w:rFonts w:ascii="Times New Roman" w:hAnsi="Times New Roman"/>
+          <w:b/>
+          <w:sz w:val="22"/>
+        </w:rPr>
+        <w:t xml:space="preserve">Raw CAMPD Dataset: </w:t>
+      </w:r>
+      <w:r>
+        <w:rPr>
+          <w:rFonts w:ascii="Times New Roman" w:hAnsi="Times New Roman"/>
+          <w:i w:val="0"/>
+          <w:sz w:val="22"/>
+        </w:rPr>
+        <w:t>https://github.com/djmsritai-tech/QM640-Data-Analytics-Capstone/blob/main/data/raw/facility-2025.csv</w:t>
+      </w:r>
+    </w:p>
+    <w:p>
+      <w:pPr>
+        <w:spacing w:after="60" w:line="276" w:lineRule="auto"/>
+        <w:jc w:val="left"/>
+      </w:pPr>
+      <w:r>
+        <w:rPr>
+          <w:rFonts w:ascii="Times New Roman" w:hAnsi="Times New Roman"/>
+          <w:b/>
+          <w:sz w:val="22"/>
+        </w:rPr>
+        <w:t xml:space="preserve">Processed Clean Dataset: </w:t>
+      </w:r>
+      <w:r>
+        <w:rPr>
+          <w:rFonts w:ascii="Times New Roman" w:hAnsi="Times New Roman"/>
+          <w:i w:val="0"/>
+          <w:sz w:val="22"/>
+        </w:rPr>
+        <w:t>https://github.com/djmsritai-tech/QM640-Data-Analytics-Capstone/blob/main/data/processed/facility_clean_processed.csv</w:t>
+      </w:r>
+    </w:p>
+    <w:p>
+      <w:pPr>
+        <w:spacing w:after="60" w:line="276" w:lineRule="auto"/>
+        <w:jc w:val="left"/>
+      </w:pPr>
+      <w:r>
+        <w:rPr>
+          <w:rFonts w:ascii="Times New Roman" w:hAnsi="Times New Roman"/>
+          <w:b/>
+          <w:sz w:val="22"/>
+        </w:rPr>
+        <w:t xml:space="preserve">Executable Jupyter Notebook (.ipynb): </w:t>
+      </w:r>
+      <w:r>
+        <w:rPr>
+          <w:rFonts w:ascii="Times New Roman" w:hAnsi="Times New Roman"/>
+          <w:i w:val="0"/>
+          <w:sz w:val="22"/>
+        </w:rPr>
+        <w:t>https://github.com/djmsritai-tech/QM640-Data-Analytics-Capstone/blob/main/QM640_Capstone_Analytics_Notebook_DhananjayVerma_0291493.ipynb</w:t>
+      </w:r>
+    </w:p>
+    <w:p>
+      <w:pPr>
+        <w:spacing w:after="160" w:line="276" w:lineRule="auto"/>
+        <w:jc w:val="left"/>
+      </w:pPr>
+      <w:r>
+        <w:rPr>
+          <w:rFonts w:ascii="Times New Roman" w:hAnsi="Times New Roman"/>
+          <w:b/>
+          <w:sz w:val="22"/>
+        </w:rPr>
+        <w:t xml:space="preserve">Python Scripts Directory: </w:t>
+      </w:r>
+      <w:r>
+        <w:rPr>
+          <w:rFonts w:ascii="Times New Roman" w:hAnsi="Times New Roman"/>
+          <w:i w:val="0"/>
+          <w:sz w:val="22"/>
+        </w:rPr>
+        <w:t>https://github.com/djmsritai-tech/QM640-Data-Analytics-Capstone/tree/main/scripts</w:t>
+      </w:r>
+    </w:p>
+    <w:p>
+      <w:pPr>
+        <w:spacing w:before="120" w:after="160" w:line="276" w:lineRule="auto"/>
+        <w:ind w:left="576" w:right="576"/>
+      </w:pPr>
+      <w:r>
+        <w:rPr>
+          <w:rFonts w:ascii="Times New Roman" w:hAnsi="Times New Roman"/>
+          <w:b/>
+          <w:color w:val="1E4678"/>
+          <w:sz w:val="20"/>
+        </w:rPr>
+        <w:t>Repository Directory Architecture:</w:t>
+        <w:br/>
+      </w:r>
+      <w:r>
+        <w:rPr>
+          <w:rFonts w:ascii="Times New Roman" w:hAnsi="Times New Roman"/>
+          <w:i/>
+          <w:sz w:val="20"/>
+        </w:rPr>
+        <w:t>QM640-Data-Analytics-Capstone/</w:t>
+        <w:br/>
+        <w:t>│</w:t>
+        <w:br/>
+        <w:t>├── data/</w:t>
+        <w:br/>
+        <w:t>│   ├── raw/</w:t>
+        <w:br/>
+        <w:t>│   │   └── facility-2025.csv             (Source EPA CAMPD archive: N = 4,050 units, 30 fields)</w:t>
+        <w:br/>
+        <w:t>│   └── processed/</w:t>
+        <w:br/>
+        <w:t>│       └── facility_clean_processed.csv  (Cleaned &amp; imputed analytical matrix: 4,050 units, 45 attributes)</w:t>
+        <w:br/>
+        <w:t>│</w:t>
+        <w:br/>
+        <w:t>├── scripts/</w:t>
+        <w:br/>
+        <w:t>│   ├── dhananjay_final_capston_report_analytics.py (Primary Python statistical, econometric &amp; ML engine)</w:t>
+        <w:br/>
+        <w:t>│   ├── build_full_interim_report.py                (Programmatic APA 7 Interim Report compiler)</w:t>
+        <w:br/>
+        <w:t>│   ├── build_full_final_report.py                  (Programmatic APA 7 Final Report compiler)</w:t>
+        <w:br/>
+        <w:t>│   └── QM640_Capstone_Analytics_Notebook_DhananjayVerma_0291493.ipynb (Interactive Jupyter Notebook)</w:t>
+        <w:br/>
+        <w:t>│</w:t>
+        <w:br/>
+        <w:t>├── outputs/</w:t>
+        <w:br/>
+        <w:t>│   ├── analytics_results.json            (Serialized JSON dictionary of model test outputs)</w:t>
+        <w:br/>
+        <w:t>│   └── figures/                          (11 high-resolution 300 DPI diagnostic charts)</w:t>
+        <w:br/>
+        <w:t>│       ├── figure0_system_architecture.png</w:t>
+        <w:br/>
+        <w:t>│       ├── figure1_fuel_emission_boxplot.png</w:t>
+        <w:br/>
+        <w:t>│       ├── figure2_unit_type_distribution.png</w:t>
+        <w:br/>
+        <w:t>│       ├── figure3_controls_by_fuel.png</w:t>
+        <w:br/>
+        <w:t>│       ├── figure4_correlation_heatmap.png</w:t>
+        <w:br/>
+        <w:t>│       ├── figure5_age_vs_heat_input_scatter.png</w:t>
+        <w:br/>
+        <w:t>│       ├── figure6_roc_curves.png</w:t>
+        <w:br/>
+        <w:t>│       ├── figure7_confusion_matrices.png</w:t>
+        <w:br/>
+        <w:t>│       ├── figure8_feature_importance.png</w:t>
+        <w:br/>
+        <w:t>│       ├── figure9_kmeans_elbow_silhouette.png</w:t>
+        <w:br/>
+        <w:t>│       └── figure10_pca_clusters.png</w:t>
+        <w:br/>
+        <w:t>│</w:t>
+        <w:br/>
+        <w:t>├── reports/</w:t>
+        <w:br/>
+        <w:t>│   ├── QM 640_Final_Report_DhananjayVerma-0291493.docx    (Compiled APA 7 Final Capstone Manuscript .docx)</w:t>
+        <w:br/>
+        <w:t>│   ├── QM 640_Final_Report_DhananjayVerma-0291493.pdf     (Compiled APA 7 Final Capstone Manuscript .pdf)</w:t>
+        <w:br/>
+        <w:t>│   ├── QM 640_Interim_Report_DhananjayVerma-0291493.docx  (Compiled APA 7 Interim Milestone Manuscript .docx)</w:t>
+        <w:br/>
+        <w:t>│   ├── QM 640_Interim_Report_DhananjayVerma-0291493.pdf   (Compiled APA 7 Interim Milestone Manuscript .pdf)</w:t>
+        <w:br/>
+        <w:t>│   └── QM640_Capstone_Synopsis_DhananjayVerma-0291493.docx (Approved Project Proposal Synopsis)</w:t>
+        <w:br/>
+        <w:t>│</w:t>
+        <w:br/>
+        <w:t>├── QM640_Capstone_Analytics_Notebook_DhananjayVerma_0291493.ipynb (Root-level Pre-Executed Notebook)</w:t>
+        <w:br/>
+        <w:t>├── requirements.txt                      (Pinned Python library dependencies)</w:t>
+        <w:br/>
+        <w:t>├── .gitignore                            (Version control exclusion specifications)</w:t>
+        <w:br/>
+        <w:t>└── README.md                             (Repository overview and reproduction guide)</w:t>
       </w:r>
     </w:p>
     <w:p>

</xml_diff>